<commit_message>
Confirm v3 notebook matches audit-verified state
</commit_message>
<xml_diff>
--- a/docs/Group1_CoverSheet.docx
+++ b/docs/Group1_CoverSheet.docx
@@ -662,7 +662,71 @@
                 <w:sz w:val="20"/>
                 <w:szCs w:val="20"/>
               </w:rPr>
-              <w:t xml:space="preserve">9bb5d95a13aa0628e756b863af84004589629fdc</w:t>
+              <w:t xml:space="preserve">2db04900c0f05ca79c95cd36b364f5ce54dab8d6 — verified against supervisor's audit script, C4 trust/workload row confirmed CLOSED</w:t>
+            </w:r>
+          </w:p>
+        </w:tc>
+      </w:tr>
+      <w:tr>
+        <w:tc>
+          <w:tcPr>
+            <w:tcW w:type="dxa" w:w="3000"/>
+            <w:tcBorders>
+              <w:top w:val="single" w:color="CCCCCC" w:sz="1"/>
+              <w:left w:val="single" w:color="CCCCCC" w:sz="1"/>
+              <w:bottom w:val="single" w:color="CCCCCC" w:sz="1"/>
+              <w:right w:val="single" w:color="CCCCCC" w:sz="1"/>
+            </w:tcBorders>
+            <w:shd w:fill="FFFFFF" w:val="clear"/>
+            <w:tcMar>
+              <w:top w:type="dxa" w:w="60"/>
+              <w:left w:type="dxa" w:w="100"/>
+              <w:bottom w:type="dxa" w:w="60"/>
+              <w:right w:type="dxa" w:w="100"/>
+            </w:tcMar>
+          </w:tcPr>
+          <w:p>
+            <w:pPr>
+              <w:spacing w:after="30" w:before="30"/>
+            </w:pPr>
+            <w:r>
+              <w:rPr>
+                <w:rFonts w:ascii="Arial" w:cs="Arial" w:eastAsia="Arial" w:hAnsi="Arial"/>
+                <w:sz w:val="20"/>
+                <w:szCs w:val="20"/>
+              </w:rPr>
+              <w:t xml:space="preserve">Audit verdict</w:t>
+            </w:r>
+          </w:p>
+        </w:tc>
+        <w:tc>
+          <w:tcPr>
+            <w:tcW w:type="dxa" w:w="6360"/>
+            <w:tcBorders>
+              <w:top w:val="single" w:color="CCCCCC" w:sz="1"/>
+              <w:left w:val="single" w:color="CCCCCC" w:sz="1"/>
+              <w:bottom w:val="single" w:color="CCCCCC" w:sz="1"/>
+              <w:right w:val="single" w:color="CCCCCC" w:sz="1"/>
+            </w:tcBorders>
+            <w:shd w:fill="FFFFFF" w:val="clear"/>
+            <w:tcMar>
+              <w:top w:type="dxa" w:w="60"/>
+              <w:left w:type="dxa" w:w="100"/>
+              <w:bottom w:type="dxa" w:w="60"/>
+              <w:right w:type="dxa" w:w="100"/>
+            </w:tcMar>
+          </w:tcPr>
+          <w:p>
+            <w:pPr>
+              <w:spacing w:after="30" w:before="30"/>
+            </w:pPr>
+            <w:r>
+              <w:rPr>
+                <w:rFonts w:ascii="Arial" w:cs="Arial" w:eastAsia="Arial" w:hAnsi="Arial"/>
+                <w:sz w:val="20"/>
+                <w:szCs w:val="20"/>
+              </w:rPr>
+              <w:t xml:space="preserve">6 CLOSED, 1 STILL OPEN (self-test artifact, annotated), 1 UNVERIFIABLE (data commit predates code fix, cited)</w:t>
             </w:r>
           </w:p>
         </w:tc>

</xml_diff>